<commit_message>
chore(eval): re-render on the merged model the folders that changed on master since serial lane 2 branched, part 02 (fb-595.54.82)
</commit_message>
<xml_diff>
--- a/courts/fifth-circuit/texas/state/court-of-civil-appeals/motion-brief/usage/OUTPUT-motion-brief.docx
+++ b/courts/fifth-circuit/texas/state/court-of-civil-appeals/motion-brief/usage/OUTPUT-motion-brief.docx
@@ -206,8 +206,9 @@
         <w:tblLook w:val="0000" w:firstRow="0" w:lastRow="0" w:firstColumn="0" w:lastColumn="0" w:noHBand="0" w:noVBand="0"/>
       </w:tblPr>
       <w:tblGrid>
-        <w:gridCol w:w="5184"/>
-        <w:gridCol w:w="4176"/>
+        <w:gridCol w:w="4464"/>
+        <w:gridCol w:w="264"/>
+        <w:gridCol w:w="4632"/>
       </w:tblGrid>
       <w:tr>
         <w:trPr>
@@ -215,7 +216,7 @@
         </w:trPr>
         <w:tc>
           <w:tcPr>
-            <w:tcW w:w="5184" w:type="dxa"/>
+            <w:tcW w:w="4464" w:type="dxa"/>
           </w:tcPr>
           <w:p>
             <w:pPr>
@@ -223,6 +224,8 @@
               <w:ind w:left="0" w:firstLine="0"/>
               <w:jc w:val="left"/>
             </w:pPr>
+            <w:bookmarkStart w:id="9001" w:name="xdr1c1a"/>
+            <w:bookmarkEnd w:id="9001"/>
             <w:r>
               <w:t xml:space="preserve">THE</w:t>
             </w:r>
@@ -338,13 +341,15 @@
             <w:r>
               <w:t xml:space="preserve">Appellee.</w:t>
             </w:r>
+            <w:bookmarkStart w:id="9002" w:name="xdr1c1z1"/>
+            <w:bookmarkEnd w:id="9002"/>
           </w:p>
         </w:tc>
         <w:tc>
           <w:tcPr>
-            <w:tcW w:w="4176" w:type="dxa"/>
+            <w:tcW w:w="264" w:type="dxa"/>
             <w:tcMar>
-              <w:left w:w="576" w:type="dxa"/>
+              <w:left w:w="168" w:type="dxa"/>
             </w:tcMar>
           </w:tcPr>
           <w:p>
@@ -354,17 +359,7 @@
               <w:jc w:val="left"/>
             </w:pPr>
             <w:r>
-              <w:t xml:space="preserve">No.</w:t>
-            </w:r>
-            <w:r>
-              <w:t xml:space="preserve"> </w:t>
-            </w:r>
-            <w:r>
-              <w:t xml:space="preserve">14</w:t>
-              <w:noBreakHyphen/>
-              <w:t xml:space="preserve">20</w:t>
-              <w:noBreakHyphen/>
-              <w:t xml:space="preserve">00627-CV</w:t>
+              <w:t xml:space="preserve">)</w:t>
             </w:r>
           </w:p>
           <w:p>
@@ -374,6 +369,137 @@
               <w:jc w:val="left"/>
             </w:pPr>
             <w:r>
+              <w:t xml:space="preserve">)</w:t>
+            </w:r>
+          </w:p>
+          <w:p>
+            <w:pPr>
+              <w:spacing w:before="0" w:after="0" w:line="322" w:lineRule="exact"/>
+              <w:ind w:left="0" w:firstLine="0"/>
+              <w:jc w:val="left"/>
+            </w:pPr>
+            <w:r>
+              <w:t xml:space="preserve">)</w:t>
+            </w:r>
+          </w:p>
+          <w:p>
+            <w:pPr>
+              <w:spacing w:before="0" w:after="0" w:line="322" w:lineRule="exact"/>
+              <w:ind w:left="0" w:firstLine="0"/>
+              <w:jc w:val="left"/>
+            </w:pPr>
+            <w:r>
+              <w:t xml:space="preserve">)</w:t>
+            </w:r>
+          </w:p>
+          <w:p>
+            <w:pPr>
+              <w:spacing w:before="0" w:after="0" w:line="322" w:lineRule="exact"/>
+              <w:ind w:left="0" w:firstLine="0"/>
+              <w:jc w:val="left"/>
+            </w:pPr>
+            <w:r>
+              <w:t xml:space="preserve">)</w:t>
+            </w:r>
+          </w:p>
+          <w:p>
+            <w:pPr>
+              <w:spacing w:before="0" w:after="0" w:line="322" w:lineRule="exact"/>
+              <w:ind w:left="0" w:firstLine="0"/>
+              <w:jc w:val="left"/>
+            </w:pPr>
+            <w:r>
+              <w:t xml:space="preserve">)</w:t>
+            </w:r>
+          </w:p>
+          <w:p>
+            <w:pPr>
+              <w:spacing w:before="0" w:after="0" w:line="322" w:lineRule="exact"/>
+              <w:ind w:left="0" w:firstLine="0"/>
+              <w:jc w:val="left"/>
+            </w:pPr>
+            <w:r>
+              <w:t xml:space="preserve">)</w:t>
+            </w:r>
+          </w:p>
+          <w:p>
+            <w:pPr>
+              <w:spacing w:before="0" w:after="0" w:line="322" w:lineRule="exact"/>
+              <w:ind w:left="0" w:firstLine="0"/>
+              <w:jc w:val="left"/>
+            </w:pPr>
+            <w:r>
+              <w:t xml:space="preserve">)</w:t>
+            </w:r>
+          </w:p>
+          <w:p>
+            <w:pPr>
+              <w:spacing w:before="0" w:after="0" w:line="322" w:lineRule="exact"/>
+              <w:ind w:left="0" w:firstLine="0"/>
+              <w:jc w:val="left"/>
+            </w:pPr>
+            <w:r>
+              <w:t xml:space="preserve">)</w:t>
+            </w:r>
+          </w:p>
+          <w:p>
+            <w:pPr>
+              <w:spacing w:before="0" w:after="0" w:line="322" w:lineRule="exact"/>
+              <w:ind w:left="0" w:firstLine="0"/>
+              <w:jc w:val="left"/>
+            </w:pPr>
+            <w:r>
+              <w:t xml:space="preserve">)</w:t>
+            </w:r>
+          </w:p>
+          <w:p>
+            <w:pPr>
+              <w:spacing w:before="0" w:after="0" w:line="322" w:lineRule="exact"/>
+              <w:ind w:left="0" w:firstLine="0"/>
+              <w:jc w:val="left"/>
+            </w:pPr>
+            <w:r>
+              <w:t xml:space="preserve">)</w:t>
+            </w:r>
+          </w:p>
+        </w:tc>
+        <w:tc>
+          <w:tcPr>
+            <w:tcW w:w="4632" w:type="dxa"/>
+            <w:tcMar>
+              <w:left w:w="168" w:type="dxa"/>
+            </w:tcMar>
+            <w:vAlign w:val="center"/>
+          </w:tcPr>
+          <w:p>
+            <w:pPr>
+              <w:spacing w:before="0" w:after="0" w:line="322" w:lineRule="exact"/>
+              <w:ind w:left="0" w:firstLine="0"/>
+              <w:jc w:val="left"/>
+            </w:pPr>
+            <w:bookmarkStart w:id="9003" w:name="xdr1c3a"/>
+            <w:bookmarkEnd w:id="9003"/>
+            <w:r>
+              <w:t xml:space="preserve">No.</w:t>
+            </w:r>
+            <w:r>
+              <w:t xml:space="preserve"> </w:t>
+            </w:r>
+            <w:r>
+              <w:t xml:space="preserve">14</w:t>
+              <w:noBreakHyphen/>
+              <w:t xml:space="preserve">20</w:t>
+              <w:noBreakHyphen/>
+              <w:t xml:space="preserve">00627-CV</w:t>
+            </w:r>
+          </w:p>
+          <w:p>
+            <w:pPr>
+              <w:spacing w:before="0" w:after="0" w:line="322" w:lineRule="exact"/>
+              <w:ind w:left="0" w:firstLine="0"/>
+              <w:jc w:val="left"/>
+            </w:pPr>
+            <w:r>
               <w:t xml:space="preserve">On</w:t>
             </w:r>
             <w:r>
@@ -436,6 +562,8 @@
             <w:r>
               <w:t xml:space="preserve">Texas</w:t>
             </w:r>
+            <w:bookmarkStart w:id="9004" w:name="xdr1c3z1"/>
+            <w:bookmarkEnd w:id="9004"/>
           </w:p>
         </w:tc>
       </w:tr>

</xml_diff>